<commit_message>
CV: actualiza CA.docx (gmail, sin teléfono, IA, foto) — faltaba por skip-worktree
</commit_message>
<xml_diff>
--- a/assets/cv/CV_AlexReyes_CA.docx
+++ b/assets/cv/CV_AlexReyes_CA.docx
@@ -17,6 +17,49 @@
         </w:rPr>
         <w:t xml:space="preserve">Manuel Alejandro Reyes Jiménez</w:t>
       </w:r>
+      <w:r>
+        <w:drawing xmlns:a="http://schemas.openxmlformats.org/drawingml/2006/main" xmlns:pic="http://schemas.openxmlformats.org/drawingml/2006/picture">
+          <wp:anchor distT="0" distB="0" distL="114300" distR="114300" simplePos="0" relativeHeight="251658240" behindDoc="0" locked="0" layoutInCell="1" allowOverlap="1">
+            <wp:simplePos x="0" y="0"/>
+            <wp:positionH relativeFrom="margin">
+              <wp:align>right</wp:align>
+            </wp:positionH>
+            <wp:positionV relativeFrom="page">
+              <wp:posOffset>378000</wp:posOffset>
+            </wp:positionV>
+            <wp:extent cx="936000" cy="1355640"/>
+            <wp:effectExtent l="0" t="0" r="0" b="0"/>
+            <wp:wrapNone/>
+            <wp:docPr id="99" name="Foto"/>
+            <wp:cNvGraphicFramePr/>
+            <a:graphic>
+              <a:graphicData uri="http://schemas.openxmlformats.org/drawingml/2006/picture">
+                <pic:pic>
+                  <pic:nvPicPr>
+                    <pic:cNvPr id="99" name="Foto"/>
+                    <pic:cNvPicPr/>
+                  </pic:nvPicPr>
+                  <pic:blipFill>
+                    <a:blip r:embed="rId8"/>
+                    <a:stretch>
+                      <a:fillRect/>
+                    </a:stretch>
+                  </pic:blipFill>
+                  <pic:spPr>
+                    <a:xfrm>
+                      <a:off x="0" y="0"/>
+                      <a:ext cx="936000" cy="1355640"/>
+                    </a:xfrm>
+                    <a:prstGeom prst="rect">
+                      <a:avLst/>
+                    </a:prstGeom>
+                  </pic:spPr>
+                </pic:pic>
+              </a:graphicData>
+            </a:graphic>
+          </wp:anchor>
+        </w:drawing>
+      </w:r>
     </w:p>
     <w:p>
       <w:pPr>
@@ -46,7 +89,7 @@
           <w:sz w:val="18"/>
           <w:szCs w:val="18"/>
         </w:rPr>
-        <w:t xml:space="preserve">Barcelona  ·  686 681 033  ·  alex_reyes_bcn@hotmail.com  ·  alexreyes.es</w:t>
+        <w:t>Barcelona  ·  areyes8602@gmail.com  ·  alexreyes.es</w:t>
       </w:r>
     </w:p>
     <w:p>
@@ -1131,7 +1174,7 @@
           <w:sz w:val="19"/>
           <w:szCs w:val="19"/>
         </w:rPr>
-        <w:t xml:space="preserve">Moodle · ClickEdu · Alexia · LaTeX · GeoGebra · Maple · Matlab · C++ · Office 365 · iBooks Author · Notion</w:t>
+        <w:t>Moodle · ClickEdu · Alexia · LaTeX · GeoGebra · Maple · Matlab · C++ · Office 365 · Notion · IA generativa (LLMs)</w:t>
       </w:r>
     </w:p>
     <w:sectPr>

</xml_diff>

<commit_message>
CV: foto headshot reubicada, preprint arXiv:2606.02621 en Publicaciones, Bachillerato generalizado (PDF+DOCX+web ES/CA/EN)
</commit_message>
<xml_diff>
--- a/assets/cv/CV_AlexReyes_CA.docx
+++ b/assets/cv/CV_AlexReyes_CA.docx
@@ -25,9 +25,9 @@
               <wp:align>right</wp:align>
             </wp:positionH>
             <wp:positionV relativeFrom="page">
-              <wp:posOffset>378000</wp:posOffset>
+              <wp:posOffset>223200</wp:posOffset>
             </wp:positionV>
-            <wp:extent cx="936000" cy="1355640"/>
+            <wp:extent cx="756000" cy="945000"/>
             <wp:effectExtent l="0" t="0" r="0" b="0"/>
             <wp:wrapNone/>
             <wp:docPr id="99" name="Foto"/>
@@ -48,7 +48,7 @@
                   <pic:spPr>
                     <a:xfrm>
                       <a:off x="0" y="0"/>
-                      <a:ext cx="936000" cy="1355640"/>
+                      <a:ext cx="756000" cy="945000"/>
                     </a:xfrm>
                     <a:prstGeom prst="rect">
                       <a:avLst/>
@@ -356,7 +356,7 @@
                 <w:sz w:val="19"/>
                 <w:szCs w:val="19"/>
               </w:rPr>
-              <w:t xml:space="preserve">IB Mathematics AI HL i SL, Matemàtiques aplicades a les CCSS de 1r Batxillerat, Matemàtiques de 2n ESO. Preparació Cangur. Coordinador TAC (2019–2024).</w:t>
+              <w:t>IB Mathematics AI HL i SL, Matemàtiques de Batxillerat, Matemàtiques de 2n ESO. Preparació Cangur. Coordinador TAC (2019–2024).</w:t>
             </w:r>
           </w:p>
         </w:tc>
@@ -496,6 +496,90 @@
         <w:gridCol w:w="2200"/>
         <w:gridCol w:w="7506"/>
       </w:tblGrid>
+      <w:tr>
+        <w:tc>
+          <w:tcPr>
+            <w:tcW w:type="dxa" w:w="2200"/>
+            <w:tcBorders>
+              <w:top w:val="none" w:color="FFFFFF" w:sz="0"/>
+              <w:left w:val="none" w:color="FFFFFF" w:sz="0"/>
+              <w:bottom w:val="none" w:color="FFFFFF" w:sz="0"/>
+              <w:right w:val="none" w:color="FFFFFF" w:sz="0"/>
+            </w:tcBorders>
+            <w:tcMar>
+              <w:top w:type="dxa" w:w="0"/>
+              <w:left w:type="dxa" w:w="0"/>
+              <w:bottom w:type="dxa" w:w="0"/>
+              <w:right w:type="dxa" w:w="100"/>
+            </w:tcMar>
+          </w:tcPr>
+          <w:p>
+            <w:pPr>
+              <w:spacing w:after="60" w:before="60" w:line="260"/>
+            </w:pPr>
+            <w:r>
+              <w:rPr>
+                <w:rFonts w:ascii="Calibri" w:cs="Calibri" w:eastAsia="Calibri" w:hAnsi="Calibri"/>
+                <w:b w:val="false"/>
+                <w:bCs w:val="false"/>
+                <w:color w:val="888888"/>
+                <w:sz w:val="18"/>
+                <w:szCs w:val="18"/>
+              </w:rPr>
+              <w:t>2026</w:t>
+            </w:r>
+          </w:p>
+        </w:tc>
+        <w:tc>
+          <w:tcPr>
+            <w:tcW w:type="dxa" w:w="7506"/>
+            <w:tcBorders>
+              <w:top w:val="none" w:color="FFFFFF" w:sz="0"/>
+              <w:left w:val="none" w:color="FFFFFF" w:sz="0"/>
+              <w:bottom w:val="none" w:color="FFFFFF" w:sz="0"/>
+              <w:right w:val="none" w:color="FFFFFF" w:sz="0"/>
+            </w:tcBorders>
+            <w:tcMar>
+              <w:top w:type="dxa" w:w="0"/>
+              <w:left w:type="dxa" w:w="0"/>
+              <w:bottom w:type="dxa" w:w="0"/>
+              <w:right w:type="dxa" w:w="0"/>
+            </w:tcMar>
+          </w:tcPr>
+          <w:p>
+            <w:pPr>
+              <w:spacing w:after="0" w:before="60" w:line="260"/>
+            </w:pPr>
+            <w:r>
+              <w:rPr>
+                <w:rFonts w:ascii="Calibri" w:cs="Calibri" w:eastAsia="Calibri" w:hAnsi="Calibri"/>
+                <w:b/>
+                <w:bCs/>
+                <w:color w:val="1A1A1A"/>
+                <w:sz w:val="21"/>
+                <w:szCs w:val="21"/>
+              </w:rPr>
+              <w:t>A Fibonacci theorem for Collatz trajectories via modular graph structure</w:t>
+            </w:r>
+          </w:p>
+          <w:p>
+            <w:pPr>
+              <w:spacing w:after="0" w:before="0" w:line="260"/>
+            </w:pPr>
+            <w:r>
+              <w:rPr>
+                <w:rFonts w:ascii="Calibri" w:cs="Calibri" w:eastAsia="Calibri" w:hAnsi="Calibri"/>
+                <w:i/>
+                <w:iCs/>
+                <w:color w:val="555555"/>
+                <w:sz w:val="19"/>
+                <w:szCs w:val="19"/>
+              </w:rPr>
+              <w:t>A. Reyes — preprint, arXiv:2606.02621 [math.NT]</w:t>
+            </w:r>
+          </w:p>
+        </w:tc>
+      </w:tr>
       <w:tr>
         <w:tc>
           <w:tcPr>

</xml_diff>

<commit_message>
CV: recorte de foto menos cerrado (cabeza y hombros) en ES/CA/EN
</commit_message>
<xml_diff>
--- a/assets/cv/CV_AlexReyes_CA.docx
+++ b/assets/cv/CV_AlexReyes_CA.docx
@@ -27,7 +27,7 @@
             <wp:positionV relativeFrom="page">
               <wp:posOffset>223200</wp:posOffset>
             </wp:positionV>
-            <wp:extent cx="756000" cy="945000"/>
+            <wp:extent cx="756000" cy="852923"/>
             <wp:effectExtent l="0" t="0" r="0" b="0"/>
             <wp:wrapNone/>
             <wp:docPr id="99" name="Foto"/>
@@ -48,7 +48,7 @@
                   <pic:spPr>
                     <a:xfrm>
                       <a:off x="0" y="0"/>
-                      <a:ext cx="756000" cy="945000"/>
+                      <a:ext cx="756000" cy="852923"/>
                     </a:xfrm>
                     <a:prstGeom prst="rect">
                       <a:avLst/>

</xml_diff>